<commit_message>
WO-B12-FIELD-COMPLETION-003: 6 서식 입력항목 보완
교정 6건:
- CONF-01: basic_info 작업 시간 추가; 출입 허가 조건 freeform → 공기 측정 결과 참조 + 환기·감시인 배치 분리
- GOV-07: repeat_table 업체/현장 열 추가 (7열, 170mm)
- P-17: basic_info 교육 언어 추가; repeat_table 성명 열 추가 (5열, 170mm)
- P-18: repeat_table 협력업체명 열 추가 (5열, 170mm)
- P-23: freeform 3개 레이블 특정화 (진행 중 위험·법정 검사·비상 연락체계)
- RP-10: 위험 요인 및 안전조치 + 출입 기록 freeform 2개 추가

격리: evidence/b12-field-fix-20261010/ (12건)
빌드: 6서식 PDF+DOCX = 12건 재생성
dry-run = 6/6 SCHEMA_VALID
build = 6/6 OK
verify-only = 6/6 PASS
pytest = 385/385 PASS
engine SHA = py=be4899da / cjs=375250c7 / docx=3c117e8b (불변)
</commit_message>
<xml_diff>
--- a/docs/reference-forms/output/TAI-FORM-CONF-01-blank.docx
+++ b/docs/reference-forms/output/TAI-FORM-CONF-01-blank.docx
@@ -183,10 +183,47 @@
                 <w:sz w:val="20"/>
                 <w:szCs w:val="20"/>
               </w:rPr>
+              <w:t xml:space="preserve">작업 시간: </w:t>
+            </w:r>
+          </w:p>
+        </w:tc>
+        <w:tc>
+          <w:tcPr>
+            <w:tcW w:type="dxa" w:w="4819"/>
+            <w:tcBorders>
+              <w:top w:val="single" w:color="000000" w:sz="4"/>
+              <w:left w:val="single" w:color="000000" w:sz="4"/>
+              <w:bottom w:val="single" w:color="000000" w:sz="4"/>
+              <w:right w:val="single" w:color="000000" w:sz="4"/>
+            </w:tcBorders>
+            <w:shd w:fill="ffffff" w:color="auto" w:val="clear"/>
+            <w:tcMar>
+              <w:top w:type="dxa" w:w="170"/>
+              <w:left w:type="dxa" w:w="170"/>
+              <w:bottom w:type="dxa" w:w="170"/>
+              <w:right w:type="dxa" w:w="170"/>
+            </w:tcMar>
+            <w:vAlign w:val="center"/>
+          </w:tcPr>
+          <w:p>
+            <w:pPr>
+              <w:jc w:val="left"/>
+            </w:pPr>
+            <w:r>
+              <w:rPr>
+                <w:rFonts w:ascii="NanumGothic" w:cs="NanumGothic" w:eastAsia="NanumGothic" w:hAnsi="NanumGothic"/>
+                <w:sz w:val="20"/>
+                <w:szCs w:val="20"/>
+              </w:rPr>
               <w:t xml:space="preserve">밀폐공간 위치: </w:t>
             </w:r>
           </w:p>
         </w:tc>
+      </w:tr>
+      <w:tr>
+        <w:trPr>
+          <w:trHeight w:val="396" w:hRule="atLeast"/>
+        </w:trPr>
         <w:tc>
           <w:tcPr>
             <w:tcW w:type="dxa" w:w="4819"/>
@@ -219,11 +256,6 @@
             </w:r>
           </w:p>
         </w:tc>
-      </w:tr>
-      <w:tr>
-        <w:trPr>
-          <w:trHeight w:val="396" w:hRule="atLeast"/>
-        </w:trPr>
         <w:tc>
           <w:tcPr>
             <w:tcW w:type="dxa" w:w="4819"/>
@@ -253,38 +285,6 @@
                 <w:szCs w:val="20"/>
               </w:rPr>
               <w:t xml:space="preserve">신청자: </w:t>
-            </w:r>
-          </w:p>
-        </w:tc>
-        <w:tc>
-          <w:tcPr>
-            <w:tcW w:type="dxa" w:w="4819"/>
-            <w:tcBorders>
-              <w:top w:val="single" w:color="000000" w:sz="4"/>
-              <w:left w:val="single" w:color="000000" w:sz="4"/>
-              <w:bottom w:val="single" w:color="000000" w:sz="4"/>
-              <w:right w:val="single" w:color="000000" w:sz="4"/>
-            </w:tcBorders>
-            <w:shd w:fill="ffffff" w:color="auto" w:val="clear"/>
-            <w:tcMar>
-              <w:top w:type="dxa" w:w="170"/>
-              <w:left w:type="dxa" w:w="170"/>
-              <w:bottom w:type="dxa" w:w="170"/>
-              <w:right w:type="dxa" w:w="170"/>
-            </w:tcMar>
-            <w:vAlign w:val="center"/>
-          </w:tcPr>
-          <w:p>
-            <w:pPr>
-              <w:jc w:val="left"/>
-            </w:pPr>
-            <w:r>
-              <w:rPr>
-                <w:rFonts w:ascii="NanumGothic" w:cs="NanumGothic" w:eastAsia="NanumGothic" w:hAnsi="NanumGothic"/>
-                <w:sz w:val="20"/>
-                <w:szCs w:val="20"/>
-              </w:rPr>
-              <w:t xml:space="preserve"/>
             </w:r>
           </w:p>
         </w:tc>
@@ -348,14 +348,106 @@
                 <w:sz w:val="20"/>
                 <w:szCs w:val="20"/>
               </w:rPr>
-              <w:t xml:space="preserve">출입 허가 조건</w:t>
+              <w:t xml:space="preserve">공기 측정 결과 참조</w:t>
             </w:r>
           </w:p>
         </w:tc>
       </w:tr>
       <w:tr>
         <w:trPr>
-          <w:trHeight w:val="1984" w:hRule="atLeast"/>
+          <w:trHeight w:val="1417" w:hRule="atLeast"/>
+        </w:trPr>
+        <w:tc>
+          <w:tcPr>
+            <w:tcW w:type="dxa" w:w="9637"/>
+            <w:tcBorders>
+              <w:top w:val="single" w:color="000000" w:sz="4"/>
+              <w:left w:val="single" w:color="000000" w:sz="4"/>
+              <w:bottom w:val="single" w:color="000000" w:sz="4"/>
+              <w:right w:val="single" w:color="000000" w:sz="4"/>
+            </w:tcBorders>
+            <w:shd w:fill="F5F5F5" w:color="auto" w:val="clear"/>
+            <w:tcMar>
+              <w:top w:type="dxa" w:w="170"/>
+              <w:left w:type="dxa" w:w="170"/>
+              <w:bottom w:type="dxa" w:w="170"/>
+              <w:right w:type="dxa" w:w="170"/>
+            </w:tcMar>
+          </w:tcPr>
+          <w:p>
+            <w:r>
+              <w:t xml:space="preserve"/>
+            </w:r>
+          </w:p>
+        </w:tc>
+      </w:tr>
+    </w:tbl>
+    <w:p>
+      <w:pPr>
+        <w:spacing w:after="80" w:before="80"/>
+      </w:pPr>
+      <w:r>
+        <w:t xml:space="preserve"/>
+      </w:r>
+    </w:p>
+    <w:tbl>
+      <w:tblPr>
+        <w:tblW w:type="dxa" w:w="9637"/>
+        <w:tblBorders>
+          <w:top w:val="single" w:color="auto" w:sz="4"/>
+          <w:left w:val="single" w:color="auto" w:sz="4"/>
+          <w:bottom w:val="single" w:color="auto" w:sz="4"/>
+          <w:right w:val="single" w:color="auto" w:sz="4"/>
+          <w:insideH w:val="single" w:color="auto" w:sz="4"/>
+          <w:insideV w:val="single" w:color="auto" w:sz="4"/>
+        </w:tblBorders>
+        <w:tblLayout w:type="fixed"/>
+      </w:tblPr>
+      <w:tblGrid>
+        <w:gridCol w:w="9637"/>
+      </w:tblGrid>
+      <w:tr>
+        <w:trPr>
+          <w:trHeight w:val="396" w:hRule="atLeast"/>
+        </w:trPr>
+        <w:tc>
+          <w:tcPr>
+            <w:tcW w:type="dxa" w:w="9637"/>
+            <w:tcBorders>
+              <w:top w:val="single" w:color="000000" w:sz="4"/>
+              <w:left w:val="single" w:color="000000" w:sz="4"/>
+              <w:bottom w:val="single" w:color="000000" w:sz="4"/>
+              <w:right w:val="single" w:color="000000" w:sz="4"/>
+            </w:tcBorders>
+            <w:shd w:fill="E8E8E8" w:color="auto" w:val="clear"/>
+            <w:tcMar>
+              <w:top w:type="dxa" w:w="170"/>
+              <w:left w:type="dxa" w:w="170"/>
+              <w:bottom w:type="dxa" w:w="170"/>
+              <w:right w:type="dxa" w:w="170"/>
+            </w:tcMar>
+            <w:vAlign w:val="center"/>
+          </w:tcPr>
+          <w:p>
+            <w:pPr>
+              <w:jc w:val="center"/>
+            </w:pPr>
+            <w:r>
+              <w:rPr>
+                <w:rFonts w:ascii="NanumGothic" w:cs="NanumGothic" w:eastAsia="NanumGothic" w:hAnsi="NanumGothic"/>
+                <w:b/>
+                <w:bCs/>
+                <w:sz w:val="20"/>
+                <w:szCs w:val="20"/>
+              </w:rPr>
+              <w:t xml:space="preserve">환기·감시인 배치</w:t>
+            </w:r>
+          </w:p>
+        </w:tc>
+      </w:tr>
+      <w:tr>
+        <w:trPr>
+          <w:trHeight w:val="1417" w:hRule="atLeast"/>
         </w:trPr>
         <w:tc>
           <w:tcPr>

</xml_diff>